<commit_message>
feat: add AI Validation admin section
</commit_message>
<xml_diff>
--- a/docs/colaboradores/contactos CRM empresas colaboracion.docx
+++ b/docs/colaboradores/contactos CRM empresas colaboracion.docx
@@ -839,6 +839,2445 @@
                 <w:szCs w:val="20"/>
               </w:rPr>
               <w:t>Pendiente</w:t>
+            </w:r>
+          </w:p>
+        </w:tc>
+      </w:tr>
+    </w:tbl>
+    <w:p>
+      <w:pPr>
+        <w:pStyle w:val="Normal"/>
+        <w:bidi w:val="0"/>
+        <w:jc w:val="left"/>
+        <w:rPr/>
+      </w:pPr>
+      <w:r>
+        <w:rPr/>
+      </w:r>
+    </w:p>
+    <w:p>
+      <w:pPr>
+        <w:pStyle w:val="Normal"/>
+        <w:bidi w:val="0"/>
+        <w:jc w:val="left"/>
+        <w:rPr/>
+      </w:pPr>
+      <w:r>
+        <w:rPr/>
+      </w:r>
+    </w:p>
+    <w:p>
+      <w:pPr>
+        <w:pStyle w:val="Normal"/>
+        <w:bidi w:val="0"/>
+        <w:jc w:val="left"/>
+        <w:rPr/>
+      </w:pPr>
+      <w:r>
+        <w:rPr/>
+      </w:r>
+    </w:p>
+    <w:p>
+      <w:pPr>
+        <w:pStyle w:val="Normal"/>
+        <w:bidi w:val="0"/>
+        <w:jc w:val="left"/>
+        <w:rPr/>
+      </w:pPr>
+      <w:r>
+        <w:rPr/>
+      </w:r>
+    </w:p>
+    <w:tbl>
+      <w:tblPr>
+        <w:tblW w:w="11803" w:type="dxa"/>
+        <w:jc w:val="left"/>
+        <w:tblInd w:w="0" w:type="dxa"/>
+        <w:tblLayout w:type="fixed"/>
+        <w:tblCellMar>
+          <w:top w:w="96" w:type="dxa"/>
+          <w:left w:w="96" w:type="dxa"/>
+          <w:bottom w:w="96" w:type="dxa"/>
+          <w:right w:w="96" w:type="dxa"/>
+        </w:tblCellMar>
+      </w:tblPr>
+      <w:tblGrid>
+        <w:gridCol w:w="2345"/>
+        <w:gridCol w:w="7382"/>
+        <w:gridCol w:w="2076"/>
+      </w:tblGrid>
+      <w:tr>
+        <w:trPr>
+          <w:tblHeader w:val="true"/>
+        </w:trPr>
+        <w:tc>
+          <w:tcPr>
+            <w:tcW w:w="2345" w:type="dxa"/>
+            <w:tcBorders>
+              <w:top w:val="single" w:sz="2" w:space="0" w:color="DDDDDD"/>
+              <w:left w:val="single" w:sz="2" w:space="0" w:color="DDDDDD"/>
+              <w:bottom w:val="single" w:sz="2" w:space="0" w:color="DDDDDD"/>
+              <w:right w:val="single" w:sz="2" w:space="0" w:color="DDDDDD"/>
+            </w:tcBorders>
+            <w:shd w:fill="F2F2F2" w:val="clear"/>
+            <w:vAlign w:val="center"/>
+          </w:tcPr>
+          <w:p>
+            <w:pPr>
+              <w:pStyle w:val="Ttulodelatabla"/>
+              <w:bidi w:val="0"/>
+              <w:jc w:val="left"/>
+              <w:rPr/>
+            </w:pPr>
+            <w:r>
+              <w:rPr/>
+              <w:t>Comunidad</w:t>
+            </w:r>
+          </w:p>
+        </w:tc>
+        <w:tc>
+          <w:tcPr>
+            <w:tcW w:w="7382" w:type="dxa"/>
+            <w:tcBorders>
+              <w:top w:val="single" w:sz="2" w:space="0" w:color="DDDDDD"/>
+              <w:left w:val="single" w:sz="2" w:space="0" w:color="DDDDDD"/>
+              <w:bottom w:val="single" w:sz="2" w:space="0" w:color="DDDDDD"/>
+              <w:right w:val="single" w:sz="2" w:space="0" w:color="DDDDDD"/>
+            </w:tcBorders>
+            <w:shd w:fill="F2F2F2" w:val="clear"/>
+            <w:vAlign w:val="center"/>
+          </w:tcPr>
+          <w:p>
+            <w:pPr>
+              <w:pStyle w:val="Ttulodelatabla"/>
+              <w:bidi w:val="0"/>
+              <w:jc w:val="left"/>
+              <w:rPr/>
+            </w:pPr>
+            <w:r>
+              <w:rPr/>
+              <w:t>Entidades ya confirmadas</w:t>
+            </w:r>
+          </w:p>
+        </w:tc>
+        <w:tc>
+          <w:tcPr>
+            <w:tcW w:w="2076" w:type="dxa"/>
+            <w:tcBorders>
+              <w:top w:val="single" w:sz="2" w:space="0" w:color="DDDDDD"/>
+              <w:left w:val="single" w:sz="2" w:space="0" w:color="DDDDDD"/>
+              <w:bottom w:val="single" w:sz="2" w:space="0" w:color="DDDDDD"/>
+              <w:right w:val="single" w:sz="2" w:space="0" w:color="DDDDDD"/>
+            </w:tcBorders>
+            <w:shd w:fill="F2F2F2" w:val="clear"/>
+            <w:vAlign w:val="center"/>
+          </w:tcPr>
+          <w:p>
+            <w:pPr>
+              <w:pStyle w:val="Ttulodelatabla"/>
+              <w:bidi w:val="0"/>
+              <w:jc w:val="left"/>
+              <w:rPr/>
+            </w:pPr>
+            <w:r>
+              <w:rPr/>
+              <w:t>Fuente oficial</w:t>
+            </w:r>
+          </w:p>
+        </w:tc>
+      </w:tr>
+      <w:tr>
+        <w:trPr/>
+        <w:tc>
+          <w:tcPr>
+            <w:tcW w:w="2345" w:type="dxa"/>
+            <w:tcBorders>
+              <w:top w:val="single" w:sz="2" w:space="0" w:color="DDDDDD"/>
+              <w:left w:val="single" w:sz="2" w:space="0" w:color="DDDDDD"/>
+              <w:bottom w:val="single" w:sz="2" w:space="0" w:color="DDDDDD"/>
+              <w:right w:val="single" w:sz="2" w:space="0" w:color="DDDDDD"/>
+            </w:tcBorders>
+            <w:vAlign w:val="center"/>
+          </w:tcPr>
+          <w:p>
+            <w:pPr>
+              <w:pStyle w:val="Contenidodelatabla"/>
+              <w:bidi w:val="0"/>
+              <w:jc w:val="left"/>
+              <w:rPr/>
+            </w:pPr>
+            <w:r>
+              <w:rPr/>
+              <w:t>Madrid</w:t>
+            </w:r>
+          </w:p>
+        </w:tc>
+        <w:tc>
+          <w:tcPr>
+            <w:tcW w:w="7382" w:type="dxa"/>
+            <w:tcBorders>
+              <w:top w:val="single" w:sz="2" w:space="0" w:color="DDDDDD"/>
+              <w:left w:val="single" w:sz="2" w:space="0" w:color="DDDDDD"/>
+              <w:bottom w:val="single" w:sz="2" w:space="0" w:color="DDDDDD"/>
+              <w:right w:val="single" w:sz="2" w:space="0" w:color="DDDDDD"/>
+            </w:tcBorders>
+            <w:vAlign w:val="center"/>
+          </w:tcPr>
+          <w:p>
+            <w:pPr>
+              <w:pStyle w:val="Contenidodelatabla"/>
+              <w:bidi w:val="0"/>
+              <w:jc w:val="left"/>
+              <w:rPr/>
+            </w:pPr>
+            <w:r>
+              <w:rPr/>
+              <w:t>APIEM, AGREMIA conaif+1</w:t>
+            </w:r>
+          </w:p>
+        </w:tc>
+        <w:tc>
+          <w:tcPr>
+            <w:tcW w:w="2076" w:type="dxa"/>
+            <w:tcBorders>
+              <w:top w:val="single" w:sz="2" w:space="0" w:color="DDDDDD"/>
+              <w:left w:val="single" w:sz="2" w:space="0" w:color="DDDDDD"/>
+              <w:bottom w:val="single" w:sz="2" w:space="0" w:color="DDDDDD"/>
+              <w:right w:val="single" w:sz="2" w:space="0" w:color="DDDDDD"/>
+            </w:tcBorders>
+            <w:vAlign w:val="center"/>
+          </w:tcPr>
+          <w:p>
+            <w:pPr>
+              <w:pStyle w:val="Contenidodelatabla"/>
+              <w:bidi w:val="0"/>
+              <w:jc w:val="left"/>
+              <w:rPr/>
+            </w:pPr>
+            <w:r>
+              <w:rPr/>
+              <w:t>Directorio CONAIF</w:t>
+            </w:r>
+          </w:p>
+        </w:tc>
+      </w:tr>
+      <w:tr>
+        <w:trPr/>
+        <w:tc>
+          <w:tcPr>
+            <w:tcW w:w="2345" w:type="dxa"/>
+            <w:tcBorders>
+              <w:top w:val="single" w:sz="2" w:space="0" w:color="DDDDDD"/>
+              <w:left w:val="single" w:sz="2" w:space="0" w:color="DDDDDD"/>
+              <w:bottom w:val="single" w:sz="2" w:space="0" w:color="DDDDDD"/>
+              <w:right w:val="single" w:sz="2" w:space="0" w:color="DDDDDD"/>
+            </w:tcBorders>
+            <w:vAlign w:val="center"/>
+          </w:tcPr>
+          <w:p>
+            <w:pPr>
+              <w:pStyle w:val="Contenidodelatabla"/>
+              <w:bidi w:val="0"/>
+              <w:jc w:val="left"/>
+              <w:rPr/>
+            </w:pPr>
+            <w:r>
+              <w:rPr/>
+              <w:t>Cataluña</w:t>
+            </w:r>
+          </w:p>
+        </w:tc>
+        <w:tc>
+          <w:tcPr>
+            <w:tcW w:w="7382" w:type="dxa"/>
+            <w:tcBorders>
+              <w:top w:val="single" w:sz="2" w:space="0" w:color="DDDDDD"/>
+              <w:left w:val="single" w:sz="2" w:space="0" w:color="DDDDDD"/>
+              <w:bottom w:val="single" w:sz="2" w:space="0" w:color="DDDDDD"/>
+              <w:right w:val="single" w:sz="2" w:space="0" w:color="DDDDDD"/>
+            </w:tcBorders>
+            <w:vAlign w:val="center"/>
+          </w:tcPr>
+          <w:p>
+            <w:pPr>
+              <w:pStyle w:val="Contenidodelatabla"/>
+              <w:bidi w:val="0"/>
+              <w:jc w:val="left"/>
+              <w:rPr/>
+            </w:pPr>
+            <w:r>
+              <w:rPr/>
+              <w:t xml:space="preserve">GREINTEC </w:t>
+            </w:r>
+            <w:hyperlink r:id="rId9" w:tgtFrame="_blank">
+              <w:r>
+                <w:rPr>
+                  <w:rStyle w:val="EnlacedeInternet"/>
+                </w:rPr>
+                <w:t>conaif</w:t>
+              </w:r>
+            </w:hyperlink>
+          </w:p>
+        </w:tc>
+        <w:tc>
+          <w:tcPr>
+            <w:tcW w:w="2076" w:type="dxa"/>
+            <w:tcBorders>
+              <w:top w:val="single" w:sz="2" w:space="0" w:color="DDDDDD"/>
+              <w:left w:val="single" w:sz="2" w:space="0" w:color="DDDDDD"/>
+              <w:bottom w:val="single" w:sz="2" w:space="0" w:color="DDDDDD"/>
+              <w:right w:val="single" w:sz="2" w:space="0" w:color="DDDDDD"/>
+            </w:tcBorders>
+            <w:vAlign w:val="center"/>
+          </w:tcPr>
+          <w:p>
+            <w:pPr>
+              <w:pStyle w:val="Contenidodelatabla"/>
+              <w:bidi w:val="0"/>
+              <w:jc w:val="left"/>
+              <w:rPr/>
+            </w:pPr>
+            <w:r>
+              <w:rPr/>
+              <w:t>Directorio CONAIF</w:t>
+            </w:r>
+          </w:p>
+        </w:tc>
+      </w:tr>
+      <w:tr>
+        <w:trPr/>
+        <w:tc>
+          <w:tcPr>
+            <w:tcW w:w="2345" w:type="dxa"/>
+            <w:tcBorders>
+              <w:top w:val="single" w:sz="2" w:space="0" w:color="DDDDDD"/>
+              <w:left w:val="single" w:sz="2" w:space="0" w:color="DDDDDD"/>
+              <w:bottom w:val="single" w:sz="2" w:space="0" w:color="DDDDDD"/>
+              <w:right w:val="single" w:sz="2" w:space="0" w:color="DDDDDD"/>
+            </w:tcBorders>
+            <w:vAlign w:val="center"/>
+          </w:tcPr>
+          <w:p>
+            <w:pPr>
+              <w:pStyle w:val="Contenidodelatabla"/>
+              <w:bidi w:val="0"/>
+              <w:jc w:val="left"/>
+              <w:rPr/>
+            </w:pPr>
+            <w:r>
+              <w:rPr/>
+              <w:t>Andalucía</w:t>
+            </w:r>
+          </w:p>
+        </w:tc>
+        <w:tc>
+          <w:tcPr>
+            <w:tcW w:w="7382" w:type="dxa"/>
+            <w:tcBorders>
+              <w:top w:val="single" w:sz="2" w:space="0" w:color="DDDDDD"/>
+              <w:left w:val="single" w:sz="2" w:space="0" w:color="DDDDDD"/>
+              <w:bottom w:val="single" w:sz="2" w:space="0" w:color="DDDDDD"/>
+              <w:right w:val="single" w:sz="2" w:space="0" w:color="DDDDDD"/>
+            </w:tcBorders>
+            <w:vAlign w:val="center"/>
+          </w:tcPr>
+          <w:p>
+            <w:pPr>
+              <w:pStyle w:val="Contenidodelatabla"/>
+              <w:bidi w:val="0"/>
+              <w:jc w:val="left"/>
+              <w:rPr/>
+            </w:pPr>
+            <w:r>
+              <w:rPr/>
+              <w:t>Presencia regional confirmada en CONAIF, sin lista completa aún conaif+1</w:t>
+            </w:r>
+          </w:p>
+        </w:tc>
+        <w:tc>
+          <w:tcPr>
+            <w:tcW w:w="2076" w:type="dxa"/>
+            <w:tcBorders>
+              <w:top w:val="single" w:sz="2" w:space="0" w:color="DDDDDD"/>
+              <w:left w:val="single" w:sz="2" w:space="0" w:color="DDDDDD"/>
+              <w:bottom w:val="single" w:sz="2" w:space="0" w:color="DDDDDD"/>
+              <w:right w:val="single" w:sz="2" w:space="0" w:color="DDDDDD"/>
+            </w:tcBorders>
+            <w:vAlign w:val="center"/>
+          </w:tcPr>
+          <w:p>
+            <w:pPr>
+              <w:pStyle w:val="Contenidodelatabla"/>
+              <w:bidi w:val="0"/>
+              <w:jc w:val="left"/>
+              <w:rPr/>
+            </w:pPr>
+            <w:r>
+              <w:rPr/>
+              <w:t>Directorio CONAIF</w:t>
+            </w:r>
+          </w:p>
+        </w:tc>
+      </w:tr>
+      <w:tr>
+        <w:trPr/>
+        <w:tc>
+          <w:tcPr>
+            <w:tcW w:w="2345" w:type="dxa"/>
+            <w:tcBorders>
+              <w:top w:val="single" w:sz="2" w:space="0" w:color="DDDDDD"/>
+              <w:left w:val="single" w:sz="2" w:space="0" w:color="DDDDDD"/>
+              <w:bottom w:val="single" w:sz="2" w:space="0" w:color="DDDDDD"/>
+              <w:right w:val="single" w:sz="2" w:space="0" w:color="DDDDDD"/>
+            </w:tcBorders>
+            <w:vAlign w:val="center"/>
+          </w:tcPr>
+          <w:p>
+            <w:pPr>
+              <w:pStyle w:val="Contenidodelatabla"/>
+              <w:bidi w:val="0"/>
+              <w:jc w:val="left"/>
+              <w:rPr/>
+            </w:pPr>
+            <w:r>
+              <w:rPr/>
+              <w:t>Comunidad Valenciana</w:t>
+            </w:r>
+          </w:p>
+        </w:tc>
+        <w:tc>
+          <w:tcPr>
+            <w:tcW w:w="7382" w:type="dxa"/>
+            <w:tcBorders>
+              <w:top w:val="single" w:sz="2" w:space="0" w:color="DDDDDD"/>
+              <w:left w:val="single" w:sz="2" w:space="0" w:color="DDDDDD"/>
+              <w:bottom w:val="single" w:sz="2" w:space="0" w:color="DDDDDD"/>
+              <w:right w:val="single" w:sz="2" w:space="0" w:color="DDDDDD"/>
+            </w:tcBorders>
+            <w:vAlign w:val="center"/>
+          </w:tcPr>
+          <w:p>
+            <w:pPr>
+              <w:pStyle w:val="Contenidodelatabla"/>
+              <w:bidi w:val="0"/>
+              <w:jc w:val="left"/>
+              <w:rPr/>
+            </w:pPr>
+            <w:r>
+              <w:rPr/>
+              <w:t xml:space="preserve">ASEIF </w:t>
+            </w:r>
+            <w:hyperlink r:id="rId10" w:tgtFrame="_blank">
+              <w:r>
+                <w:rPr>
+                  <w:rStyle w:val="EnlacedeInternet"/>
+                </w:rPr>
+                <w:t>conaif</w:t>
+              </w:r>
+            </w:hyperlink>
+          </w:p>
+        </w:tc>
+        <w:tc>
+          <w:tcPr>
+            <w:tcW w:w="2076" w:type="dxa"/>
+            <w:tcBorders>
+              <w:top w:val="single" w:sz="2" w:space="0" w:color="DDDDDD"/>
+              <w:left w:val="single" w:sz="2" w:space="0" w:color="DDDDDD"/>
+              <w:bottom w:val="single" w:sz="2" w:space="0" w:color="DDDDDD"/>
+              <w:right w:val="single" w:sz="2" w:space="0" w:color="DDDDDD"/>
+            </w:tcBorders>
+            <w:vAlign w:val="center"/>
+          </w:tcPr>
+          <w:p>
+            <w:pPr>
+              <w:pStyle w:val="Contenidodelatabla"/>
+              <w:bidi w:val="0"/>
+              <w:jc w:val="left"/>
+              <w:rPr/>
+            </w:pPr>
+            <w:r>
+              <w:rPr/>
+              <w:t>Directorio CONAIF</w:t>
+            </w:r>
+          </w:p>
+        </w:tc>
+      </w:tr>
+    </w:tbl>
+    <w:p>
+      <w:pPr>
+        <w:pStyle w:val="Normal"/>
+        <w:bidi w:val="0"/>
+        <w:jc w:val="left"/>
+        <w:rPr/>
+      </w:pPr>
+      <w:r>
+        <w:rPr/>
+      </w:r>
+    </w:p>
+    <w:p>
+      <w:pPr>
+        <w:pStyle w:val="Normal"/>
+        <w:bidi w:val="0"/>
+        <w:jc w:val="left"/>
+        <w:rPr/>
+      </w:pPr>
+      <w:r>
+        <w:rPr/>
+      </w:r>
+    </w:p>
+    <w:p>
+      <w:pPr>
+        <w:pStyle w:val="Normal"/>
+        <w:bidi w:val="0"/>
+        <w:jc w:val="left"/>
+        <w:rPr/>
+      </w:pPr>
+      <w:r>
+        <w:rPr/>
+      </w:r>
+    </w:p>
+    <w:tbl>
+      <w:tblPr>
+        <w:tblW w:w="14570" w:type="dxa"/>
+        <w:jc w:val="left"/>
+        <w:tblInd w:w="0" w:type="dxa"/>
+        <w:tblLayout w:type="fixed"/>
+        <w:tblCellMar>
+          <w:top w:w="96" w:type="dxa"/>
+          <w:left w:w="96" w:type="dxa"/>
+          <w:bottom w:w="96" w:type="dxa"/>
+          <w:right w:w="96" w:type="dxa"/>
+        </w:tblCellMar>
+      </w:tblPr>
+      <w:tblGrid>
+        <w:gridCol w:w="1499"/>
+        <w:gridCol w:w="1517"/>
+        <w:gridCol w:w="1460"/>
+        <w:gridCol w:w="1082"/>
+        <w:gridCol w:w="1346"/>
+        <w:gridCol w:w="1130"/>
+        <w:gridCol w:w="2440"/>
+        <w:gridCol w:w="1745"/>
+        <w:gridCol w:w="1100"/>
+        <w:gridCol w:w="1251"/>
+      </w:tblGrid>
+      <w:tr>
+        <w:trPr>
+          <w:tblHeader w:val="true"/>
+        </w:trPr>
+        <w:tc>
+          <w:tcPr>
+            <w:tcW w:w="1499" w:type="dxa"/>
+            <w:tcBorders>
+              <w:top w:val="single" w:sz="2" w:space="0" w:color="DDDDDD"/>
+              <w:left w:val="single" w:sz="2" w:space="0" w:color="DDDDDD"/>
+              <w:bottom w:val="single" w:sz="2" w:space="0" w:color="DDDDDD"/>
+              <w:right w:val="single" w:sz="2" w:space="0" w:color="DDDDDD"/>
+            </w:tcBorders>
+            <w:shd w:fill="F2F2F2" w:val="clear"/>
+            <w:vAlign w:val="center"/>
+          </w:tcPr>
+          <w:p>
+            <w:pPr>
+              <w:pStyle w:val="Ttulodelatabla"/>
+              <w:bidi w:val="0"/>
+              <w:jc w:val="left"/>
+              <w:rPr/>
+            </w:pPr>
+            <w:r>
+              <w:rPr/>
+              <w:t>Organización</w:t>
+            </w:r>
+          </w:p>
+        </w:tc>
+        <w:tc>
+          <w:tcPr>
+            <w:tcW w:w="1517" w:type="dxa"/>
+            <w:tcBorders>
+              <w:top w:val="single" w:sz="2" w:space="0" w:color="DDDDDD"/>
+              <w:left w:val="single" w:sz="2" w:space="0" w:color="DDDDDD"/>
+              <w:bottom w:val="single" w:sz="2" w:space="0" w:color="DDDDDD"/>
+              <w:right w:val="single" w:sz="2" w:space="0" w:color="DDDDDD"/>
+            </w:tcBorders>
+            <w:shd w:fill="F2F2F2" w:val="clear"/>
+            <w:vAlign w:val="center"/>
+          </w:tcPr>
+          <w:p>
+            <w:pPr>
+              <w:pStyle w:val="Ttulodelatabla"/>
+              <w:bidi w:val="0"/>
+              <w:jc w:val="left"/>
+              <w:rPr/>
+            </w:pPr>
+            <w:r>
+              <w:rPr/>
+              <w:t>Ámbito</w:t>
+            </w:r>
+          </w:p>
+        </w:tc>
+        <w:tc>
+          <w:tcPr>
+            <w:tcW w:w="1460" w:type="dxa"/>
+            <w:tcBorders>
+              <w:top w:val="single" w:sz="2" w:space="0" w:color="DDDDDD"/>
+              <w:left w:val="single" w:sz="2" w:space="0" w:color="DDDDDD"/>
+              <w:bottom w:val="single" w:sz="2" w:space="0" w:color="DDDDDD"/>
+              <w:right w:val="single" w:sz="2" w:space="0" w:color="DDDDDD"/>
+            </w:tcBorders>
+            <w:shd w:fill="F2F2F2" w:val="clear"/>
+            <w:vAlign w:val="center"/>
+          </w:tcPr>
+          <w:p>
+            <w:pPr>
+              <w:pStyle w:val="Ttulodelatabla"/>
+              <w:bidi w:val="0"/>
+              <w:jc w:val="left"/>
+              <w:rPr/>
+            </w:pPr>
+            <w:r>
+              <w:rPr/>
+              <w:t>Comunidad</w:t>
+            </w:r>
+          </w:p>
+        </w:tc>
+        <w:tc>
+          <w:tcPr>
+            <w:tcW w:w="1082" w:type="dxa"/>
+            <w:tcBorders>
+              <w:top w:val="single" w:sz="2" w:space="0" w:color="DDDDDD"/>
+              <w:left w:val="single" w:sz="2" w:space="0" w:color="DDDDDD"/>
+              <w:bottom w:val="single" w:sz="2" w:space="0" w:color="DDDDDD"/>
+              <w:right w:val="single" w:sz="2" w:space="0" w:color="DDDDDD"/>
+            </w:tcBorders>
+            <w:shd w:fill="F2F2F2" w:val="clear"/>
+            <w:vAlign w:val="center"/>
+          </w:tcPr>
+          <w:p>
+            <w:pPr>
+              <w:pStyle w:val="Ttulodelatabla"/>
+              <w:bidi w:val="0"/>
+              <w:jc w:val="left"/>
+              <w:rPr/>
+            </w:pPr>
+            <w:r>
+              <w:rPr/>
+              <w:t>Provincia</w:t>
+            </w:r>
+          </w:p>
+        </w:tc>
+        <w:tc>
+          <w:tcPr>
+            <w:tcW w:w="1346" w:type="dxa"/>
+            <w:tcBorders>
+              <w:top w:val="single" w:sz="2" w:space="0" w:color="DDDDDD"/>
+              <w:left w:val="single" w:sz="2" w:space="0" w:color="DDDDDD"/>
+              <w:bottom w:val="single" w:sz="2" w:space="0" w:color="DDDDDD"/>
+              <w:right w:val="single" w:sz="2" w:space="0" w:color="DDDDDD"/>
+            </w:tcBorders>
+            <w:shd w:fill="F2F2F2" w:val="clear"/>
+            <w:vAlign w:val="center"/>
+          </w:tcPr>
+          <w:p>
+            <w:pPr>
+              <w:pStyle w:val="Ttulodelatabla"/>
+              <w:bidi w:val="0"/>
+              <w:jc w:val="left"/>
+              <w:rPr/>
+            </w:pPr>
+            <w:r>
+              <w:rPr/>
+              <w:t>Web</w:t>
+            </w:r>
+          </w:p>
+        </w:tc>
+        <w:tc>
+          <w:tcPr>
+            <w:tcW w:w="1130" w:type="dxa"/>
+            <w:tcBorders>
+              <w:top w:val="single" w:sz="2" w:space="0" w:color="DDDDDD"/>
+              <w:left w:val="single" w:sz="2" w:space="0" w:color="DDDDDD"/>
+              <w:bottom w:val="single" w:sz="2" w:space="0" w:color="DDDDDD"/>
+              <w:right w:val="single" w:sz="2" w:space="0" w:color="DDDDDD"/>
+            </w:tcBorders>
+            <w:shd w:fill="F2F2F2" w:val="clear"/>
+            <w:vAlign w:val="center"/>
+          </w:tcPr>
+          <w:p>
+            <w:pPr>
+              <w:pStyle w:val="Ttulodelatabla"/>
+              <w:bidi w:val="0"/>
+              <w:jc w:val="left"/>
+              <w:rPr/>
+            </w:pPr>
+            <w:r>
+              <w:rPr/>
+              <w:t>Teléfono</w:t>
+            </w:r>
+          </w:p>
+        </w:tc>
+        <w:tc>
+          <w:tcPr>
+            <w:tcW w:w="2440" w:type="dxa"/>
+            <w:tcBorders>
+              <w:top w:val="single" w:sz="2" w:space="0" w:color="DDDDDD"/>
+              <w:left w:val="single" w:sz="2" w:space="0" w:color="DDDDDD"/>
+              <w:bottom w:val="single" w:sz="2" w:space="0" w:color="DDDDDD"/>
+              <w:right w:val="single" w:sz="2" w:space="0" w:color="DDDDDD"/>
+            </w:tcBorders>
+            <w:shd w:fill="F2F2F2" w:val="clear"/>
+            <w:vAlign w:val="center"/>
+          </w:tcPr>
+          <w:p>
+            <w:pPr>
+              <w:pStyle w:val="Ttulodelatabla"/>
+              <w:bidi w:val="0"/>
+              <w:jc w:val="left"/>
+              <w:rPr/>
+            </w:pPr>
+            <w:r>
+              <w:rPr/>
+              <w:t>Email general</w:t>
+            </w:r>
+          </w:p>
+        </w:tc>
+        <w:tc>
+          <w:tcPr>
+            <w:tcW w:w="1745" w:type="dxa"/>
+            <w:tcBorders>
+              <w:top w:val="single" w:sz="2" w:space="0" w:color="DDDDDD"/>
+              <w:left w:val="single" w:sz="2" w:space="0" w:color="DDDDDD"/>
+              <w:bottom w:val="single" w:sz="2" w:space="0" w:color="DDDDDD"/>
+              <w:right w:val="single" w:sz="2" w:space="0" w:color="DDDDDD"/>
+            </w:tcBorders>
+            <w:shd w:fill="F2F2F2" w:val="clear"/>
+            <w:vAlign w:val="center"/>
+          </w:tcPr>
+          <w:p>
+            <w:pPr>
+              <w:pStyle w:val="Ttulodelatabla"/>
+              <w:bidi w:val="0"/>
+              <w:jc w:val="left"/>
+              <w:rPr/>
+            </w:pPr>
+            <w:r>
+              <w:rPr/>
+              <w:t>Sectores</w:t>
+            </w:r>
+          </w:p>
+        </w:tc>
+        <w:tc>
+          <w:tcPr>
+            <w:tcW w:w="1100" w:type="dxa"/>
+            <w:tcBorders>
+              <w:top w:val="single" w:sz="2" w:space="0" w:color="DDDDDD"/>
+              <w:left w:val="single" w:sz="2" w:space="0" w:color="DDDDDD"/>
+              <w:bottom w:val="single" w:sz="2" w:space="0" w:color="DDDDDD"/>
+              <w:right w:val="single" w:sz="2" w:space="0" w:color="DDDDDD"/>
+            </w:tcBorders>
+            <w:shd w:fill="F2F2F2" w:val="clear"/>
+            <w:vAlign w:val="center"/>
+          </w:tcPr>
+          <w:p>
+            <w:pPr>
+              <w:pStyle w:val="Ttulodelatabla"/>
+              <w:bidi w:val="0"/>
+              <w:jc w:val="left"/>
+              <w:rPr/>
+            </w:pPr>
+            <w:r>
+              <w:rPr/>
+              <w:t>Prioridad</w:t>
+            </w:r>
+          </w:p>
+        </w:tc>
+        <w:tc>
+          <w:tcPr>
+            <w:tcW w:w="1251" w:type="dxa"/>
+            <w:tcBorders>
+              <w:top w:val="single" w:sz="2" w:space="0" w:color="DDDDDD"/>
+              <w:left w:val="single" w:sz="2" w:space="0" w:color="DDDDDD"/>
+              <w:bottom w:val="single" w:sz="2" w:space="0" w:color="DDDDDD"/>
+              <w:right w:val="single" w:sz="2" w:space="0" w:color="DDDDDD"/>
+            </w:tcBorders>
+            <w:shd w:fill="F2F2F2" w:val="clear"/>
+            <w:vAlign w:val="center"/>
+          </w:tcPr>
+          <w:p>
+            <w:pPr>
+              <w:pStyle w:val="Ttulodelatabla"/>
+              <w:bidi w:val="0"/>
+              <w:jc w:val="left"/>
+              <w:rPr/>
+            </w:pPr>
+            <w:r>
+              <w:rPr/>
+              <w:t>Estado comercial</w:t>
+            </w:r>
+          </w:p>
+        </w:tc>
+      </w:tr>
+      <w:tr>
+        <w:trPr/>
+        <w:tc>
+          <w:tcPr>
+            <w:tcW w:w="1499" w:type="dxa"/>
+            <w:tcBorders>
+              <w:top w:val="single" w:sz="2" w:space="0" w:color="DDDDDD"/>
+              <w:left w:val="single" w:sz="2" w:space="0" w:color="DDDDDD"/>
+              <w:bottom w:val="single" w:sz="2" w:space="0" w:color="DDDDDD"/>
+              <w:right w:val="single" w:sz="2" w:space="0" w:color="DDDDDD"/>
+            </w:tcBorders>
+            <w:vAlign w:val="center"/>
+          </w:tcPr>
+          <w:p>
+            <w:pPr>
+              <w:pStyle w:val="Contenidodelatabla"/>
+              <w:bidi w:val="0"/>
+              <w:jc w:val="left"/>
+              <w:rPr/>
+            </w:pPr>
+            <w:r>
+              <w:rPr/>
+              <w:t>APIEM</w:t>
+            </w:r>
+          </w:p>
+        </w:tc>
+        <w:tc>
+          <w:tcPr>
+            <w:tcW w:w="1517" w:type="dxa"/>
+            <w:tcBorders>
+              <w:top w:val="single" w:sz="2" w:space="0" w:color="DDDDDD"/>
+              <w:left w:val="single" w:sz="2" w:space="0" w:color="DDDDDD"/>
+              <w:bottom w:val="single" w:sz="2" w:space="0" w:color="DDDDDD"/>
+              <w:right w:val="single" w:sz="2" w:space="0" w:color="DDDDDD"/>
+            </w:tcBorders>
+            <w:vAlign w:val="center"/>
+          </w:tcPr>
+          <w:p>
+            <w:pPr>
+              <w:pStyle w:val="Contenidodelatabla"/>
+              <w:bidi w:val="0"/>
+              <w:jc w:val="left"/>
+              <w:rPr/>
+            </w:pPr>
+            <w:r>
+              <w:rPr/>
+              <w:t>Autonómico/Provincial</w:t>
+            </w:r>
+          </w:p>
+        </w:tc>
+        <w:tc>
+          <w:tcPr>
+            <w:tcW w:w="1460" w:type="dxa"/>
+            <w:tcBorders>
+              <w:top w:val="single" w:sz="2" w:space="0" w:color="DDDDDD"/>
+              <w:left w:val="single" w:sz="2" w:space="0" w:color="DDDDDD"/>
+              <w:bottom w:val="single" w:sz="2" w:space="0" w:color="DDDDDD"/>
+              <w:right w:val="single" w:sz="2" w:space="0" w:color="DDDDDD"/>
+            </w:tcBorders>
+            <w:vAlign w:val="center"/>
+          </w:tcPr>
+          <w:p>
+            <w:pPr>
+              <w:pStyle w:val="Contenidodelatabla"/>
+              <w:bidi w:val="0"/>
+              <w:jc w:val="left"/>
+              <w:rPr/>
+            </w:pPr>
+            <w:r>
+              <w:rPr/>
+              <w:t>Comunidad de Madrid</w:t>
+            </w:r>
+          </w:p>
+        </w:tc>
+        <w:tc>
+          <w:tcPr>
+            <w:tcW w:w="1082" w:type="dxa"/>
+            <w:tcBorders>
+              <w:top w:val="single" w:sz="2" w:space="0" w:color="DDDDDD"/>
+              <w:left w:val="single" w:sz="2" w:space="0" w:color="DDDDDD"/>
+              <w:bottom w:val="single" w:sz="2" w:space="0" w:color="DDDDDD"/>
+              <w:right w:val="single" w:sz="2" w:space="0" w:color="DDDDDD"/>
+            </w:tcBorders>
+            <w:vAlign w:val="center"/>
+          </w:tcPr>
+          <w:p>
+            <w:pPr>
+              <w:pStyle w:val="Contenidodelatabla"/>
+              <w:bidi w:val="0"/>
+              <w:jc w:val="left"/>
+              <w:rPr/>
+            </w:pPr>
+            <w:r>
+              <w:rPr/>
+              <w:t>Madrid</w:t>
+            </w:r>
+          </w:p>
+        </w:tc>
+        <w:tc>
+          <w:tcPr>
+            <w:tcW w:w="1346" w:type="dxa"/>
+            <w:tcBorders>
+              <w:top w:val="single" w:sz="2" w:space="0" w:color="DDDDDD"/>
+              <w:left w:val="single" w:sz="2" w:space="0" w:color="DDDDDD"/>
+              <w:bottom w:val="single" w:sz="2" w:space="0" w:color="DDDDDD"/>
+              <w:right w:val="single" w:sz="2" w:space="0" w:color="DDDDDD"/>
+            </w:tcBorders>
+            <w:vAlign w:val="center"/>
+          </w:tcPr>
+          <w:p>
+            <w:pPr>
+              <w:pStyle w:val="Contenidodelatabla"/>
+              <w:bidi w:val="0"/>
+              <w:jc w:val="left"/>
+              <w:rPr/>
+            </w:pPr>
+            <w:hyperlink r:id="rId11" w:tgtFrame="_blank">
+              <w:r>
+                <w:rPr>
+                  <w:rStyle w:val="EnlacedeInternet"/>
+                </w:rPr>
+                <w:t>apiem.org</w:t>
+              </w:r>
+            </w:hyperlink>
+          </w:p>
+        </w:tc>
+        <w:tc>
+          <w:tcPr>
+            <w:tcW w:w="1130" w:type="dxa"/>
+            <w:tcBorders>
+              <w:top w:val="single" w:sz="2" w:space="0" w:color="DDDDDD"/>
+              <w:left w:val="single" w:sz="2" w:space="0" w:color="DDDDDD"/>
+              <w:bottom w:val="single" w:sz="2" w:space="0" w:color="DDDDDD"/>
+              <w:right w:val="single" w:sz="2" w:space="0" w:color="DDDDDD"/>
+            </w:tcBorders>
+            <w:vAlign w:val="center"/>
+          </w:tcPr>
+          <w:p>
+            <w:pPr>
+              <w:pStyle w:val="Contenidodelatabla"/>
+              <w:bidi w:val="0"/>
+              <w:jc w:val="left"/>
+              <w:rPr/>
+            </w:pPr>
+            <w:r>
+              <w:rPr/>
+              <w:t xml:space="preserve">91 594 52 71 </w:t>
+            </w:r>
+            <w:hyperlink r:id="rId12" w:tgtFrame="_blank">
+              <w:r>
+                <w:rPr>
+                  <w:rStyle w:val="EnlacedeInternet"/>
+                </w:rPr>
+                <w:t>conaif</w:t>
+              </w:r>
+            </w:hyperlink>
+          </w:p>
+        </w:tc>
+        <w:tc>
+          <w:tcPr>
+            <w:tcW w:w="2440" w:type="dxa"/>
+            <w:tcBorders>
+              <w:top w:val="single" w:sz="2" w:space="0" w:color="DDDDDD"/>
+              <w:left w:val="single" w:sz="2" w:space="0" w:color="DDDDDD"/>
+              <w:bottom w:val="single" w:sz="2" w:space="0" w:color="DDDDDD"/>
+              <w:right w:val="single" w:sz="2" w:space="0" w:color="DDDDDD"/>
+            </w:tcBorders>
+            <w:vAlign w:val="center"/>
+          </w:tcPr>
+          <w:p>
+            <w:pPr>
+              <w:pStyle w:val="Contenidodelatabla"/>
+              <w:bidi w:val="0"/>
+              <w:jc w:val="left"/>
+              <w:rPr/>
+            </w:pPr>
+            <w:r>
+              <w:rPr/>
+              <w:t xml:space="preserve">apiem@apiem.org </w:t>
+            </w:r>
+            <w:hyperlink r:id="rId13" w:tgtFrame="_blank">
+              <w:r>
+                <w:rPr>
+                  <w:rStyle w:val="EnlacedeInternet"/>
+                </w:rPr>
+                <w:t>conaif</w:t>
+              </w:r>
+            </w:hyperlink>
+          </w:p>
+        </w:tc>
+        <w:tc>
+          <w:tcPr>
+            <w:tcW w:w="1745" w:type="dxa"/>
+            <w:tcBorders>
+              <w:top w:val="single" w:sz="2" w:space="0" w:color="DDDDDD"/>
+              <w:left w:val="single" w:sz="2" w:space="0" w:color="DDDDDD"/>
+              <w:bottom w:val="single" w:sz="2" w:space="0" w:color="DDDDDD"/>
+              <w:right w:val="single" w:sz="2" w:space="0" w:color="DDDDDD"/>
+            </w:tcBorders>
+            <w:vAlign w:val="center"/>
+          </w:tcPr>
+          <w:p>
+            <w:pPr>
+              <w:pStyle w:val="Contenidodelatabla"/>
+              <w:bidi w:val="0"/>
+              <w:jc w:val="left"/>
+              <w:rPr/>
+            </w:pPr>
+            <w:r>
+              <w:rPr/>
+              <w:t xml:space="preserve">Electricidad, telecomunicaciones </w:t>
+            </w:r>
+            <w:hyperlink r:id="rId14" w:tgtFrame="_blank">
+              <w:r>
+                <w:rPr>
+                  <w:rStyle w:val="EnlacedeInternet"/>
+                </w:rPr>
+                <w:t>conaif</w:t>
+              </w:r>
+            </w:hyperlink>
+          </w:p>
+        </w:tc>
+        <w:tc>
+          <w:tcPr>
+            <w:tcW w:w="1100" w:type="dxa"/>
+            <w:tcBorders>
+              <w:top w:val="single" w:sz="2" w:space="0" w:color="DDDDDD"/>
+              <w:left w:val="single" w:sz="2" w:space="0" w:color="DDDDDD"/>
+              <w:bottom w:val="single" w:sz="2" w:space="0" w:color="DDDDDD"/>
+              <w:right w:val="single" w:sz="2" w:space="0" w:color="DDDDDD"/>
+            </w:tcBorders>
+            <w:vAlign w:val="center"/>
+          </w:tcPr>
+          <w:p>
+            <w:pPr>
+              <w:pStyle w:val="Contenidodelatabla"/>
+              <w:bidi w:val="0"/>
+              <w:jc w:val="left"/>
+              <w:rPr/>
+            </w:pPr>
+            <w:r>
+              <w:rPr/>
+              <w:t>Muy alta</w:t>
+            </w:r>
+          </w:p>
+        </w:tc>
+        <w:tc>
+          <w:tcPr>
+            <w:tcW w:w="1251" w:type="dxa"/>
+            <w:tcBorders>
+              <w:top w:val="single" w:sz="2" w:space="0" w:color="DDDDDD"/>
+              <w:left w:val="single" w:sz="2" w:space="0" w:color="DDDDDD"/>
+              <w:bottom w:val="single" w:sz="2" w:space="0" w:color="DDDDDD"/>
+              <w:right w:val="single" w:sz="2" w:space="0" w:color="DDDDDD"/>
+            </w:tcBorders>
+            <w:vAlign w:val="center"/>
+          </w:tcPr>
+          <w:p>
+            <w:pPr>
+              <w:pStyle w:val="Contenidodelatabla"/>
+              <w:bidi w:val="0"/>
+              <w:jc w:val="left"/>
+              <w:rPr/>
+            </w:pPr>
+            <w:r>
+              <w:rPr/>
+              <w:t>Pendiente</w:t>
+            </w:r>
+          </w:p>
+        </w:tc>
+      </w:tr>
+      <w:tr>
+        <w:trPr/>
+        <w:tc>
+          <w:tcPr>
+            <w:tcW w:w="1499" w:type="dxa"/>
+            <w:tcBorders>
+              <w:top w:val="single" w:sz="2" w:space="0" w:color="DDDDDD"/>
+              <w:left w:val="single" w:sz="2" w:space="0" w:color="DDDDDD"/>
+              <w:bottom w:val="single" w:sz="2" w:space="0" w:color="DDDDDD"/>
+              <w:right w:val="single" w:sz="2" w:space="0" w:color="DDDDDD"/>
+            </w:tcBorders>
+            <w:vAlign w:val="center"/>
+          </w:tcPr>
+          <w:p>
+            <w:pPr>
+              <w:pStyle w:val="Contenidodelatabla"/>
+              <w:bidi w:val="0"/>
+              <w:jc w:val="left"/>
+              <w:rPr/>
+            </w:pPr>
+            <w:r>
+              <w:rPr/>
+              <w:t>AGREMIA</w:t>
+            </w:r>
+          </w:p>
+        </w:tc>
+        <w:tc>
+          <w:tcPr>
+            <w:tcW w:w="1517" w:type="dxa"/>
+            <w:tcBorders>
+              <w:top w:val="single" w:sz="2" w:space="0" w:color="DDDDDD"/>
+              <w:left w:val="single" w:sz="2" w:space="0" w:color="DDDDDD"/>
+              <w:bottom w:val="single" w:sz="2" w:space="0" w:color="DDDDDD"/>
+              <w:right w:val="single" w:sz="2" w:space="0" w:color="DDDDDD"/>
+            </w:tcBorders>
+            <w:vAlign w:val="center"/>
+          </w:tcPr>
+          <w:p>
+            <w:pPr>
+              <w:pStyle w:val="Contenidodelatabla"/>
+              <w:bidi w:val="0"/>
+              <w:jc w:val="left"/>
+              <w:rPr/>
+            </w:pPr>
+            <w:r>
+              <w:rPr/>
+              <w:t>Autonómico/Provincial</w:t>
+            </w:r>
+          </w:p>
+        </w:tc>
+        <w:tc>
+          <w:tcPr>
+            <w:tcW w:w="1460" w:type="dxa"/>
+            <w:tcBorders>
+              <w:top w:val="single" w:sz="2" w:space="0" w:color="DDDDDD"/>
+              <w:left w:val="single" w:sz="2" w:space="0" w:color="DDDDDD"/>
+              <w:bottom w:val="single" w:sz="2" w:space="0" w:color="DDDDDD"/>
+              <w:right w:val="single" w:sz="2" w:space="0" w:color="DDDDDD"/>
+            </w:tcBorders>
+            <w:vAlign w:val="center"/>
+          </w:tcPr>
+          <w:p>
+            <w:pPr>
+              <w:pStyle w:val="Contenidodelatabla"/>
+              <w:bidi w:val="0"/>
+              <w:jc w:val="left"/>
+              <w:rPr/>
+            </w:pPr>
+            <w:r>
+              <w:rPr/>
+              <w:t>Comunidad de Madrid</w:t>
+            </w:r>
+          </w:p>
+        </w:tc>
+        <w:tc>
+          <w:tcPr>
+            <w:tcW w:w="1082" w:type="dxa"/>
+            <w:tcBorders>
+              <w:top w:val="single" w:sz="2" w:space="0" w:color="DDDDDD"/>
+              <w:left w:val="single" w:sz="2" w:space="0" w:color="DDDDDD"/>
+              <w:bottom w:val="single" w:sz="2" w:space="0" w:color="DDDDDD"/>
+              <w:right w:val="single" w:sz="2" w:space="0" w:color="DDDDDD"/>
+            </w:tcBorders>
+            <w:vAlign w:val="center"/>
+          </w:tcPr>
+          <w:p>
+            <w:pPr>
+              <w:pStyle w:val="Contenidodelatabla"/>
+              <w:bidi w:val="0"/>
+              <w:jc w:val="left"/>
+              <w:rPr/>
+            </w:pPr>
+            <w:r>
+              <w:rPr/>
+              <w:t>Madrid</w:t>
+            </w:r>
+          </w:p>
+        </w:tc>
+        <w:tc>
+          <w:tcPr>
+            <w:tcW w:w="1346" w:type="dxa"/>
+            <w:tcBorders>
+              <w:top w:val="single" w:sz="2" w:space="0" w:color="DDDDDD"/>
+              <w:left w:val="single" w:sz="2" w:space="0" w:color="DDDDDD"/>
+              <w:bottom w:val="single" w:sz="2" w:space="0" w:color="DDDDDD"/>
+              <w:right w:val="single" w:sz="2" w:space="0" w:color="DDDDDD"/>
+            </w:tcBorders>
+            <w:vAlign w:val="center"/>
+          </w:tcPr>
+          <w:p>
+            <w:pPr>
+              <w:pStyle w:val="Contenidodelatabla"/>
+              <w:bidi w:val="0"/>
+              <w:jc w:val="left"/>
+              <w:rPr/>
+            </w:pPr>
+            <w:hyperlink r:id="rId15" w:tgtFrame="_blank">
+              <w:r>
+                <w:rPr>
+                  <w:rStyle w:val="EnlacedeInternet"/>
+                </w:rPr>
+                <w:t>agremia.com</w:t>
+              </w:r>
+            </w:hyperlink>
+          </w:p>
+        </w:tc>
+        <w:tc>
+          <w:tcPr>
+            <w:tcW w:w="1130" w:type="dxa"/>
+            <w:tcBorders>
+              <w:top w:val="single" w:sz="2" w:space="0" w:color="DDDDDD"/>
+              <w:left w:val="single" w:sz="2" w:space="0" w:color="DDDDDD"/>
+              <w:bottom w:val="single" w:sz="2" w:space="0" w:color="DDDDDD"/>
+              <w:right w:val="single" w:sz="2" w:space="0" w:color="DDDDDD"/>
+            </w:tcBorders>
+            <w:vAlign w:val="center"/>
+          </w:tcPr>
+          <w:p>
+            <w:pPr>
+              <w:pStyle w:val="Contenidodelatabla"/>
+              <w:bidi w:val="0"/>
+              <w:jc w:val="left"/>
+              <w:rPr/>
+            </w:pPr>
+            <w:r>
+              <w:rPr/>
+              <w:t xml:space="preserve">91 468 72 51 </w:t>
+            </w:r>
+            <w:hyperlink r:id="rId16" w:tgtFrame="_blank">
+              <w:r>
+                <w:rPr>
+                  <w:rStyle w:val="EnlacedeInternet"/>
+                </w:rPr>
+                <w:t>conaif</w:t>
+              </w:r>
+            </w:hyperlink>
+          </w:p>
+        </w:tc>
+        <w:tc>
+          <w:tcPr>
+            <w:tcW w:w="2440" w:type="dxa"/>
+            <w:tcBorders>
+              <w:top w:val="single" w:sz="2" w:space="0" w:color="DDDDDD"/>
+              <w:left w:val="single" w:sz="2" w:space="0" w:color="DDDDDD"/>
+              <w:bottom w:val="single" w:sz="2" w:space="0" w:color="DDDDDD"/>
+              <w:right w:val="single" w:sz="2" w:space="0" w:color="DDDDDD"/>
+            </w:tcBorders>
+            <w:vAlign w:val="center"/>
+          </w:tcPr>
+          <w:p>
+            <w:pPr>
+              <w:pStyle w:val="Contenidodelatabla"/>
+              <w:bidi w:val="0"/>
+              <w:jc w:val="left"/>
+              <w:rPr/>
+            </w:pPr>
+            <w:r>
+              <w:rPr/>
+              <w:t xml:space="preserve">agremia@agremia.com </w:t>
+            </w:r>
+            <w:hyperlink r:id="rId17" w:tgtFrame="_blank">
+              <w:r>
+                <w:rPr>
+                  <w:rStyle w:val="EnlacedeInternet"/>
+                </w:rPr>
+                <w:t>conaif</w:t>
+              </w:r>
+            </w:hyperlink>
+          </w:p>
+        </w:tc>
+        <w:tc>
+          <w:tcPr>
+            <w:tcW w:w="1745" w:type="dxa"/>
+            <w:tcBorders>
+              <w:top w:val="single" w:sz="2" w:space="0" w:color="DDDDDD"/>
+              <w:left w:val="single" w:sz="2" w:space="0" w:color="DDDDDD"/>
+              <w:bottom w:val="single" w:sz="2" w:space="0" w:color="DDDDDD"/>
+              <w:right w:val="single" w:sz="2" w:space="0" w:color="DDDDDD"/>
+            </w:tcBorders>
+            <w:vAlign w:val="center"/>
+          </w:tcPr>
+          <w:p>
+            <w:pPr>
+              <w:pStyle w:val="Contenidodelatabla"/>
+              <w:bidi w:val="0"/>
+              <w:jc w:val="left"/>
+              <w:rPr/>
+            </w:pPr>
+            <w:r>
+              <w:rPr/>
+              <w:t xml:space="preserve">Instalaciones y energía </w:t>
+            </w:r>
+            <w:hyperlink r:id="rId18" w:tgtFrame="_blank">
+              <w:r>
+                <w:rPr>
+                  <w:rStyle w:val="EnlacedeInternet"/>
+                </w:rPr>
+                <w:t>conaif</w:t>
+              </w:r>
+            </w:hyperlink>
+          </w:p>
+        </w:tc>
+        <w:tc>
+          <w:tcPr>
+            <w:tcW w:w="1100" w:type="dxa"/>
+            <w:tcBorders>
+              <w:top w:val="single" w:sz="2" w:space="0" w:color="DDDDDD"/>
+              <w:left w:val="single" w:sz="2" w:space="0" w:color="DDDDDD"/>
+              <w:bottom w:val="single" w:sz="2" w:space="0" w:color="DDDDDD"/>
+              <w:right w:val="single" w:sz="2" w:space="0" w:color="DDDDDD"/>
+            </w:tcBorders>
+            <w:vAlign w:val="center"/>
+          </w:tcPr>
+          <w:p>
+            <w:pPr>
+              <w:pStyle w:val="Contenidodelatabla"/>
+              <w:bidi w:val="0"/>
+              <w:jc w:val="left"/>
+              <w:rPr/>
+            </w:pPr>
+            <w:r>
+              <w:rPr/>
+              <w:t>Muy alta</w:t>
+            </w:r>
+          </w:p>
+        </w:tc>
+        <w:tc>
+          <w:tcPr>
+            <w:tcW w:w="1251" w:type="dxa"/>
+            <w:tcBorders>
+              <w:top w:val="single" w:sz="2" w:space="0" w:color="DDDDDD"/>
+              <w:left w:val="single" w:sz="2" w:space="0" w:color="DDDDDD"/>
+              <w:bottom w:val="single" w:sz="2" w:space="0" w:color="DDDDDD"/>
+              <w:right w:val="single" w:sz="2" w:space="0" w:color="DDDDDD"/>
+            </w:tcBorders>
+            <w:vAlign w:val="center"/>
+          </w:tcPr>
+          <w:p>
+            <w:pPr>
+              <w:pStyle w:val="Contenidodelatabla"/>
+              <w:bidi w:val="0"/>
+              <w:jc w:val="left"/>
+              <w:rPr/>
+            </w:pPr>
+            <w:r>
+              <w:rPr/>
+              <w:t>Pendiente</w:t>
+            </w:r>
+          </w:p>
+        </w:tc>
+      </w:tr>
+    </w:tbl>
+    <w:p>
+      <w:pPr>
+        <w:pStyle w:val="Normal"/>
+        <w:bidi w:val="0"/>
+        <w:jc w:val="left"/>
+        <w:rPr/>
+      </w:pPr>
+      <w:r>
+        <w:rPr/>
+      </w:r>
+    </w:p>
+    <w:p>
+      <w:pPr>
+        <w:pStyle w:val="Normal"/>
+        <w:bidi w:val="0"/>
+        <w:jc w:val="left"/>
+        <w:rPr/>
+      </w:pPr>
+      <w:r>
+        <w:rPr/>
+      </w:r>
+    </w:p>
+    <w:tbl>
+      <w:tblPr>
+        <w:tblW w:w="14570" w:type="dxa"/>
+        <w:jc w:val="left"/>
+        <w:tblInd w:w="0" w:type="dxa"/>
+        <w:tblLayout w:type="fixed"/>
+        <w:tblCellMar>
+          <w:top w:w="96" w:type="dxa"/>
+          <w:left w:w="96" w:type="dxa"/>
+          <w:bottom w:w="96" w:type="dxa"/>
+          <w:right w:w="96" w:type="dxa"/>
+        </w:tblCellMar>
+      </w:tblPr>
+      <w:tblGrid>
+        <w:gridCol w:w="1499"/>
+        <w:gridCol w:w="1571"/>
+        <w:gridCol w:w="1525"/>
+        <w:gridCol w:w="1082"/>
+        <w:gridCol w:w="1133"/>
+        <w:gridCol w:w="1188"/>
+        <w:gridCol w:w="1944"/>
+        <w:gridCol w:w="2235"/>
+        <w:gridCol w:w="1100"/>
+        <w:gridCol w:w="1293"/>
+      </w:tblGrid>
+      <w:tr>
+        <w:trPr>
+          <w:tblHeader w:val="true"/>
+        </w:trPr>
+        <w:tc>
+          <w:tcPr>
+            <w:tcW w:w="1499" w:type="dxa"/>
+            <w:tcBorders>
+              <w:top w:val="single" w:sz="2" w:space="0" w:color="DDDDDD"/>
+              <w:left w:val="single" w:sz="2" w:space="0" w:color="DDDDDD"/>
+              <w:bottom w:val="single" w:sz="2" w:space="0" w:color="DDDDDD"/>
+              <w:right w:val="single" w:sz="2" w:space="0" w:color="DDDDDD"/>
+            </w:tcBorders>
+            <w:shd w:fill="F2F2F2" w:val="clear"/>
+            <w:vAlign w:val="center"/>
+          </w:tcPr>
+          <w:p>
+            <w:pPr>
+              <w:pStyle w:val="Ttulodelatabla"/>
+              <w:bidi w:val="0"/>
+              <w:jc w:val="left"/>
+              <w:rPr/>
+            </w:pPr>
+            <w:r>
+              <w:rPr/>
+              <w:t>Organización</w:t>
+            </w:r>
+          </w:p>
+        </w:tc>
+        <w:tc>
+          <w:tcPr>
+            <w:tcW w:w="1571" w:type="dxa"/>
+            <w:tcBorders>
+              <w:top w:val="single" w:sz="2" w:space="0" w:color="DDDDDD"/>
+              <w:left w:val="single" w:sz="2" w:space="0" w:color="DDDDDD"/>
+              <w:bottom w:val="single" w:sz="2" w:space="0" w:color="DDDDDD"/>
+              <w:right w:val="single" w:sz="2" w:space="0" w:color="DDDDDD"/>
+            </w:tcBorders>
+            <w:shd w:fill="F2F2F2" w:val="clear"/>
+            <w:vAlign w:val="center"/>
+          </w:tcPr>
+          <w:p>
+            <w:pPr>
+              <w:pStyle w:val="Ttulodelatabla"/>
+              <w:bidi w:val="0"/>
+              <w:jc w:val="left"/>
+              <w:rPr/>
+            </w:pPr>
+            <w:r>
+              <w:rPr/>
+              <w:t>Ámbito</w:t>
+            </w:r>
+          </w:p>
+        </w:tc>
+        <w:tc>
+          <w:tcPr>
+            <w:tcW w:w="1525" w:type="dxa"/>
+            <w:tcBorders>
+              <w:top w:val="single" w:sz="2" w:space="0" w:color="DDDDDD"/>
+              <w:left w:val="single" w:sz="2" w:space="0" w:color="DDDDDD"/>
+              <w:bottom w:val="single" w:sz="2" w:space="0" w:color="DDDDDD"/>
+              <w:right w:val="single" w:sz="2" w:space="0" w:color="DDDDDD"/>
+            </w:tcBorders>
+            <w:shd w:fill="F2F2F2" w:val="clear"/>
+            <w:vAlign w:val="center"/>
+          </w:tcPr>
+          <w:p>
+            <w:pPr>
+              <w:pStyle w:val="Ttulodelatabla"/>
+              <w:bidi w:val="0"/>
+              <w:jc w:val="left"/>
+              <w:rPr/>
+            </w:pPr>
+            <w:r>
+              <w:rPr/>
+              <w:t>Comunidad</w:t>
+            </w:r>
+          </w:p>
+        </w:tc>
+        <w:tc>
+          <w:tcPr>
+            <w:tcW w:w="1082" w:type="dxa"/>
+            <w:tcBorders>
+              <w:top w:val="single" w:sz="2" w:space="0" w:color="DDDDDD"/>
+              <w:left w:val="single" w:sz="2" w:space="0" w:color="DDDDDD"/>
+              <w:bottom w:val="single" w:sz="2" w:space="0" w:color="DDDDDD"/>
+              <w:right w:val="single" w:sz="2" w:space="0" w:color="DDDDDD"/>
+            </w:tcBorders>
+            <w:shd w:fill="F2F2F2" w:val="clear"/>
+            <w:vAlign w:val="center"/>
+          </w:tcPr>
+          <w:p>
+            <w:pPr>
+              <w:pStyle w:val="Ttulodelatabla"/>
+              <w:bidi w:val="0"/>
+              <w:jc w:val="left"/>
+              <w:rPr/>
+            </w:pPr>
+            <w:r>
+              <w:rPr/>
+              <w:t>Provincia</w:t>
+            </w:r>
+          </w:p>
+        </w:tc>
+        <w:tc>
+          <w:tcPr>
+            <w:tcW w:w="1133" w:type="dxa"/>
+            <w:tcBorders>
+              <w:top w:val="single" w:sz="2" w:space="0" w:color="DDDDDD"/>
+              <w:left w:val="single" w:sz="2" w:space="0" w:color="DDDDDD"/>
+              <w:bottom w:val="single" w:sz="2" w:space="0" w:color="DDDDDD"/>
+              <w:right w:val="single" w:sz="2" w:space="0" w:color="DDDDDD"/>
+            </w:tcBorders>
+            <w:shd w:fill="F2F2F2" w:val="clear"/>
+            <w:vAlign w:val="center"/>
+          </w:tcPr>
+          <w:p>
+            <w:pPr>
+              <w:pStyle w:val="Ttulodelatabla"/>
+              <w:bidi w:val="0"/>
+              <w:jc w:val="left"/>
+              <w:rPr/>
+            </w:pPr>
+            <w:r>
+              <w:rPr/>
+              <w:t>Web</w:t>
+            </w:r>
+          </w:p>
+        </w:tc>
+        <w:tc>
+          <w:tcPr>
+            <w:tcW w:w="1188" w:type="dxa"/>
+            <w:tcBorders>
+              <w:top w:val="single" w:sz="2" w:space="0" w:color="DDDDDD"/>
+              <w:left w:val="single" w:sz="2" w:space="0" w:color="DDDDDD"/>
+              <w:bottom w:val="single" w:sz="2" w:space="0" w:color="DDDDDD"/>
+              <w:right w:val="single" w:sz="2" w:space="0" w:color="DDDDDD"/>
+            </w:tcBorders>
+            <w:shd w:fill="F2F2F2" w:val="clear"/>
+            <w:vAlign w:val="center"/>
+          </w:tcPr>
+          <w:p>
+            <w:pPr>
+              <w:pStyle w:val="Ttulodelatabla"/>
+              <w:bidi w:val="0"/>
+              <w:jc w:val="left"/>
+              <w:rPr/>
+            </w:pPr>
+            <w:r>
+              <w:rPr/>
+              <w:t>Teléfono</w:t>
+            </w:r>
+          </w:p>
+        </w:tc>
+        <w:tc>
+          <w:tcPr>
+            <w:tcW w:w="1944" w:type="dxa"/>
+            <w:tcBorders>
+              <w:top w:val="single" w:sz="2" w:space="0" w:color="DDDDDD"/>
+              <w:left w:val="single" w:sz="2" w:space="0" w:color="DDDDDD"/>
+              <w:bottom w:val="single" w:sz="2" w:space="0" w:color="DDDDDD"/>
+              <w:right w:val="single" w:sz="2" w:space="0" w:color="DDDDDD"/>
+            </w:tcBorders>
+            <w:shd w:fill="F2F2F2" w:val="clear"/>
+            <w:vAlign w:val="center"/>
+          </w:tcPr>
+          <w:p>
+            <w:pPr>
+              <w:pStyle w:val="Ttulodelatabla"/>
+              <w:bidi w:val="0"/>
+              <w:jc w:val="left"/>
+              <w:rPr/>
+            </w:pPr>
+            <w:r>
+              <w:rPr/>
+              <w:t>Email general</w:t>
+            </w:r>
+          </w:p>
+        </w:tc>
+        <w:tc>
+          <w:tcPr>
+            <w:tcW w:w="2235" w:type="dxa"/>
+            <w:tcBorders>
+              <w:top w:val="single" w:sz="2" w:space="0" w:color="DDDDDD"/>
+              <w:left w:val="single" w:sz="2" w:space="0" w:color="DDDDDD"/>
+              <w:bottom w:val="single" w:sz="2" w:space="0" w:color="DDDDDD"/>
+              <w:right w:val="single" w:sz="2" w:space="0" w:color="DDDDDD"/>
+            </w:tcBorders>
+            <w:shd w:fill="F2F2F2" w:val="clear"/>
+            <w:vAlign w:val="center"/>
+          </w:tcPr>
+          <w:p>
+            <w:pPr>
+              <w:pStyle w:val="Ttulodelatabla"/>
+              <w:bidi w:val="0"/>
+              <w:jc w:val="left"/>
+              <w:rPr/>
+            </w:pPr>
+            <w:r>
+              <w:rPr/>
+              <w:t>Sectores</w:t>
+            </w:r>
+          </w:p>
+        </w:tc>
+        <w:tc>
+          <w:tcPr>
+            <w:tcW w:w="1100" w:type="dxa"/>
+            <w:tcBorders>
+              <w:top w:val="single" w:sz="2" w:space="0" w:color="DDDDDD"/>
+              <w:left w:val="single" w:sz="2" w:space="0" w:color="DDDDDD"/>
+              <w:bottom w:val="single" w:sz="2" w:space="0" w:color="DDDDDD"/>
+              <w:right w:val="single" w:sz="2" w:space="0" w:color="DDDDDD"/>
+            </w:tcBorders>
+            <w:shd w:fill="F2F2F2" w:val="clear"/>
+            <w:vAlign w:val="center"/>
+          </w:tcPr>
+          <w:p>
+            <w:pPr>
+              <w:pStyle w:val="Ttulodelatabla"/>
+              <w:bidi w:val="0"/>
+              <w:jc w:val="left"/>
+              <w:rPr/>
+            </w:pPr>
+            <w:r>
+              <w:rPr/>
+              <w:t>Prioridad</w:t>
+            </w:r>
+          </w:p>
+        </w:tc>
+        <w:tc>
+          <w:tcPr>
+            <w:tcW w:w="1293" w:type="dxa"/>
+            <w:tcBorders>
+              <w:top w:val="single" w:sz="2" w:space="0" w:color="DDDDDD"/>
+              <w:left w:val="single" w:sz="2" w:space="0" w:color="DDDDDD"/>
+              <w:bottom w:val="single" w:sz="2" w:space="0" w:color="DDDDDD"/>
+              <w:right w:val="single" w:sz="2" w:space="0" w:color="DDDDDD"/>
+            </w:tcBorders>
+            <w:shd w:fill="F2F2F2" w:val="clear"/>
+            <w:vAlign w:val="center"/>
+          </w:tcPr>
+          <w:p>
+            <w:pPr>
+              <w:pStyle w:val="Ttulodelatabla"/>
+              <w:bidi w:val="0"/>
+              <w:jc w:val="left"/>
+              <w:rPr/>
+            </w:pPr>
+            <w:r>
+              <w:rPr/>
+              <w:t>Estado comercial</w:t>
+            </w:r>
+          </w:p>
+        </w:tc>
+      </w:tr>
+      <w:tr>
+        <w:trPr/>
+        <w:tc>
+          <w:tcPr>
+            <w:tcW w:w="1499" w:type="dxa"/>
+            <w:tcBorders>
+              <w:top w:val="single" w:sz="2" w:space="0" w:color="DDDDDD"/>
+              <w:left w:val="single" w:sz="2" w:space="0" w:color="DDDDDD"/>
+              <w:bottom w:val="single" w:sz="2" w:space="0" w:color="DDDDDD"/>
+              <w:right w:val="single" w:sz="2" w:space="0" w:color="DDDDDD"/>
+            </w:tcBorders>
+            <w:vAlign w:val="center"/>
+          </w:tcPr>
+          <w:p>
+            <w:pPr>
+              <w:pStyle w:val="Contenidodelatabla"/>
+              <w:bidi w:val="0"/>
+              <w:jc w:val="left"/>
+              <w:rPr/>
+            </w:pPr>
+            <w:r>
+              <w:rPr/>
+              <w:t>ASEIF</w:t>
+            </w:r>
+          </w:p>
+        </w:tc>
+        <w:tc>
+          <w:tcPr>
+            <w:tcW w:w="1571" w:type="dxa"/>
+            <w:tcBorders>
+              <w:top w:val="single" w:sz="2" w:space="0" w:color="DDDDDD"/>
+              <w:left w:val="single" w:sz="2" w:space="0" w:color="DDDDDD"/>
+              <w:bottom w:val="single" w:sz="2" w:space="0" w:color="DDDDDD"/>
+              <w:right w:val="single" w:sz="2" w:space="0" w:color="DDDDDD"/>
+            </w:tcBorders>
+            <w:vAlign w:val="center"/>
+          </w:tcPr>
+          <w:p>
+            <w:pPr>
+              <w:pStyle w:val="Contenidodelatabla"/>
+              <w:bidi w:val="0"/>
+              <w:jc w:val="left"/>
+              <w:rPr/>
+            </w:pPr>
+            <w:r>
+              <w:rPr/>
+              <w:t>Autonómico/Provincial</w:t>
+            </w:r>
+          </w:p>
+        </w:tc>
+        <w:tc>
+          <w:tcPr>
+            <w:tcW w:w="1525" w:type="dxa"/>
+            <w:tcBorders>
+              <w:top w:val="single" w:sz="2" w:space="0" w:color="DDDDDD"/>
+              <w:left w:val="single" w:sz="2" w:space="0" w:color="DDDDDD"/>
+              <w:bottom w:val="single" w:sz="2" w:space="0" w:color="DDDDDD"/>
+              <w:right w:val="single" w:sz="2" w:space="0" w:color="DDDDDD"/>
+            </w:tcBorders>
+            <w:vAlign w:val="center"/>
+          </w:tcPr>
+          <w:p>
+            <w:pPr>
+              <w:pStyle w:val="Contenidodelatabla"/>
+              <w:bidi w:val="0"/>
+              <w:jc w:val="left"/>
+              <w:rPr/>
+            </w:pPr>
+            <w:r>
+              <w:rPr/>
+              <w:t>Comunidad Valenciana</w:t>
+            </w:r>
+          </w:p>
+        </w:tc>
+        <w:tc>
+          <w:tcPr>
+            <w:tcW w:w="1082" w:type="dxa"/>
+            <w:tcBorders>
+              <w:top w:val="single" w:sz="2" w:space="0" w:color="DDDDDD"/>
+              <w:left w:val="single" w:sz="2" w:space="0" w:color="DDDDDD"/>
+              <w:bottom w:val="single" w:sz="2" w:space="0" w:color="DDDDDD"/>
+              <w:right w:val="single" w:sz="2" w:space="0" w:color="DDDDDD"/>
+            </w:tcBorders>
+            <w:vAlign w:val="center"/>
+          </w:tcPr>
+          <w:p>
+            <w:pPr>
+              <w:pStyle w:val="Contenidodelatabla"/>
+              <w:bidi w:val="0"/>
+              <w:jc w:val="left"/>
+              <w:rPr/>
+            </w:pPr>
+            <w:r>
+              <w:rPr/>
+              <w:t>Valencia</w:t>
+            </w:r>
+          </w:p>
+        </w:tc>
+        <w:tc>
+          <w:tcPr>
+            <w:tcW w:w="1133" w:type="dxa"/>
+            <w:tcBorders>
+              <w:top w:val="single" w:sz="2" w:space="0" w:color="DDDDDD"/>
+              <w:left w:val="single" w:sz="2" w:space="0" w:color="DDDDDD"/>
+              <w:bottom w:val="single" w:sz="2" w:space="0" w:color="DDDDDD"/>
+              <w:right w:val="single" w:sz="2" w:space="0" w:color="DDDDDD"/>
+            </w:tcBorders>
+            <w:vAlign w:val="center"/>
+          </w:tcPr>
+          <w:p>
+            <w:pPr>
+              <w:pStyle w:val="Contenidodelatabla"/>
+              <w:bidi w:val="0"/>
+              <w:jc w:val="left"/>
+              <w:rPr/>
+            </w:pPr>
+            <w:hyperlink r:id="rId19" w:tgtFrame="_blank">
+              <w:r>
+                <w:rPr>
+                  <w:rStyle w:val="EnlacedeInternet"/>
+                </w:rPr>
+                <w:t>femeval.es</w:t>
+              </w:r>
+            </w:hyperlink>
+          </w:p>
+        </w:tc>
+        <w:tc>
+          <w:tcPr>
+            <w:tcW w:w="1188" w:type="dxa"/>
+            <w:tcBorders>
+              <w:top w:val="single" w:sz="2" w:space="0" w:color="DDDDDD"/>
+              <w:left w:val="single" w:sz="2" w:space="0" w:color="DDDDDD"/>
+              <w:bottom w:val="single" w:sz="2" w:space="0" w:color="DDDDDD"/>
+              <w:right w:val="single" w:sz="2" w:space="0" w:color="DDDDDD"/>
+            </w:tcBorders>
+            <w:vAlign w:val="center"/>
+          </w:tcPr>
+          <w:p>
+            <w:pPr>
+              <w:pStyle w:val="Contenidodelatabla"/>
+              <w:bidi w:val="0"/>
+              <w:jc w:val="left"/>
+              <w:rPr/>
+            </w:pPr>
+            <w:r>
+              <w:rPr/>
+              <w:t xml:space="preserve">963 71 97 61 </w:t>
+            </w:r>
+            <w:hyperlink r:id="rId20" w:tgtFrame="_blank">
+              <w:r>
+                <w:rPr>
+                  <w:rStyle w:val="EnlacedeInternet"/>
+                </w:rPr>
+                <w:t>conaif</w:t>
+              </w:r>
+            </w:hyperlink>
+          </w:p>
+        </w:tc>
+        <w:tc>
+          <w:tcPr>
+            <w:tcW w:w="1944" w:type="dxa"/>
+            <w:tcBorders>
+              <w:top w:val="single" w:sz="2" w:space="0" w:color="DDDDDD"/>
+              <w:left w:val="single" w:sz="2" w:space="0" w:color="DDDDDD"/>
+              <w:bottom w:val="single" w:sz="2" w:space="0" w:color="DDDDDD"/>
+              <w:right w:val="single" w:sz="2" w:space="0" w:color="DDDDDD"/>
+            </w:tcBorders>
+            <w:vAlign w:val="center"/>
+          </w:tcPr>
+          <w:p>
+            <w:pPr>
+              <w:pStyle w:val="Contenidodelatabla"/>
+              <w:bidi w:val="0"/>
+              <w:jc w:val="left"/>
+              <w:rPr/>
+            </w:pPr>
+            <w:r>
+              <w:rPr/>
+              <w:t xml:space="preserve">aseif@femeval.es </w:t>
+            </w:r>
+            <w:hyperlink r:id="rId21" w:tgtFrame="_blank">
+              <w:r>
+                <w:rPr>
+                  <w:rStyle w:val="EnlacedeInternet"/>
+                </w:rPr>
+                <w:t>conaif</w:t>
+              </w:r>
+            </w:hyperlink>
+          </w:p>
+        </w:tc>
+        <w:tc>
+          <w:tcPr>
+            <w:tcW w:w="2235" w:type="dxa"/>
+            <w:tcBorders>
+              <w:top w:val="single" w:sz="2" w:space="0" w:color="DDDDDD"/>
+              <w:left w:val="single" w:sz="2" w:space="0" w:color="DDDDDD"/>
+              <w:bottom w:val="single" w:sz="2" w:space="0" w:color="DDDDDD"/>
+              <w:right w:val="single" w:sz="2" w:space="0" w:color="DDDDDD"/>
+            </w:tcBorders>
+            <w:vAlign w:val="center"/>
+          </w:tcPr>
+          <w:p>
+            <w:pPr>
+              <w:pStyle w:val="Contenidodelatabla"/>
+              <w:bidi w:val="0"/>
+              <w:jc w:val="left"/>
+              <w:rPr/>
+            </w:pPr>
+            <w:r>
+              <w:rPr/>
+              <w:t xml:space="preserve">Fontanería, instalaciones térmicas, gases y demás fluidos </w:t>
+            </w:r>
+            <w:hyperlink r:id="rId22" w:tgtFrame="_blank">
+              <w:r>
+                <w:rPr>
+                  <w:rStyle w:val="EnlacedeInternet"/>
+                </w:rPr>
+                <w:t>conaif</w:t>
+              </w:r>
+            </w:hyperlink>
+          </w:p>
+        </w:tc>
+        <w:tc>
+          <w:tcPr>
+            <w:tcW w:w="1100" w:type="dxa"/>
+            <w:tcBorders>
+              <w:top w:val="single" w:sz="2" w:space="0" w:color="DDDDDD"/>
+              <w:left w:val="single" w:sz="2" w:space="0" w:color="DDDDDD"/>
+              <w:bottom w:val="single" w:sz="2" w:space="0" w:color="DDDDDD"/>
+              <w:right w:val="single" w:sz="2" w:space="0" w:color="DDDDDD"/>
+            </w:tcBorders>
+            <w:vAlign w:val="center"/>
+          </w:tcPr>
+          <w:p>
+            <w:pPr>
+              <w:pStyle w:val="Contenidodelatabla"/>
+              <w:bidi w:val="0"/>
+              <w:jc w:val="left"/>
+              <w:rPr/>
+            </w:pPr>
+            <w:r>
+              <w:rPr/>
+              <w:t>Muy alta</w:t>
+            </w:r>
+          </w:p>
+        </w:tc>
+        <w:tc>
+          <w:tcPr>
+            <w:tcW w:w="1293" w:type="dxa"/>
+            <w:tcBorders>
+              <w:top w:val="single" w:sz="2" w:space="0" w:color="DDDDDD"/>
+              <w:left w:val="single" w:sz="2" w:space="0" w:color="DDDDDD"/>
+              <w:bottom w:val="single" w:sz="2" w:space="0" w:color="DDDDDD"/>
+              <w:right w:val="single" w:sz="2" w:space="0" w:color="DDDDDD"/>
+            </w:tcBorders>
+            <w:vAlign w:val="center"/>
+          </w:tcPr>
+          <w:p>
+            <w:pPr>
+              <w:pStyle w:val="Contenidodelatabla"/>
+              <w:bidi w:val="0"/>
+              <w:jc w:val="left"/>
+              <w:rPr/>
+            </w:pPr>
+            <w:r>
+              <w:rPr/>
+              <w:t>Pendiente</w:t>
+            </w:r>
+          </w:p>
+        </w:tc>
+      </w:tr>
+    </w:tbl>
+    <w:p>
+      <w:pPr>
+        <w:pStyle w:val="Normal"/>
+        <w:bidi w:val="0"/>
+        <w:jc w:val="left"/>
+        <w:rPr/>
+      </w:pPr>
+      <w:r>
+        <w:rPr/>
+      </w:r>
+    </w:p>
+    <w:p>
+      <w:pPr>
+        <w:pStyle w:val="Normal"/>
+        <w:bidi w:val="0"/>
+        <w:jc w:val="left"/>
+        <w:rPr/>
+      </w:pPr>
+      <w:r>
+        <w:rPr/>
+      </w:r>
+    </w:p>
+    <w:tbl>
+      <w:tblPr>
+        <w:tblW w:w="14570" w:type="dxa"/>
+        <w:jc w:val="left"/>
+        <w:tblInd w:w="0" w:type="dxa"/>
+        <w:tblLayout w:type="fixed"/>
+        <w:tblCellMar>
+          <w:top w:w="96" w:type="dxa"/>
+          <w:left w:w="96" w:type="dxa"/>
+          <w:bottom w:w="96" w:type="dxa"/>
+          <w:right w:w="96" w:type="dxa"/>
+        </w:tblCellMar>
+      </w:tblPr>
+      <w:tblGrid>
+        <w:gridCol w:w="1499"/>
+        <w:gridCol w:w="1441"/>
+        <w:gridCol w:w="1314"/>
+        <w:gridCol w:w="1082"/>
+        <w:gridCol w:w="1694"/>
+        <w:gridCol w:w="1279"/>
+        <w:gridCol w:w="1072"/>
+        <w:gridCol w:w="2282"/>
+        <w:gridCol w:w="1769"/>
+        <w:gridCol w:w="1138"/>
+      </w:tblGrid>
+      <w:tr>
+        <w:trPr>
+          <w:tblHeader w:val="true"/>
+        </w:trPr>
+        <w:tc>
+          <w:tcPr>
+            <w:tcW w:w="1499" w:type="dxa"/>
+            <w:tcBorders>
+              <w:top w:val="single" w:sz="2" w:space="0" w:color="DDDDDD"/>
+              <w:left w:val="single" w:sz="2" w:space="0" w:color="DDDDDD"/>
+              <w:bottom w:val="single" w:sz="2" w:space="0" w:color="DDDDDD"/>
+              <w:right w:val="single" w:sz="2" w:space="0" w:color="DDDDDD"/>
+            </w:tcBorders>
+            <w:shd w:fill="F2F2F2" w:val="clear"/>
+            <w:vAlign w:val="center"/>
+          </w:tcPr>
+          <w:p>
+            <w:pPr>
+              <w:pStyle w:val="Ttulodelatabla"/>
+              <w:bidi w:val="0"/>
+              <w:jc w:val="left"/>
+              <w:rPr/>
+            </w:pPr>
+            <w:r>
+              <w:rPr/>
+              <w:t>Organización</w:t>
+            </w:r>
+          </w:p>
+        </w:tc>
+        <w:tc>
+          <w:tcPr>
+            <w:tcW w:w="1441" w:type="dxa"/>
+            <w:tcBorders>
+              <w:top w:val="single" w:sz="2" w:space="0" w:color="DDDDDD"/>
+              <w:left w:val="single" w:sz="2" w:space="0" w:color="DDDDDD"/>
+              <w:bottom w:val="single" w:sz="2" w:space="0" w:color="DDDDDD"/>
+              <w:right w:val="single" w:sz="2" w:space="0" w:color="DDDDDD"/>
+            </w:tcBorders>
+            <w:shd w:fill="F2F2F2" w:val="clear"/>
+            <w:vAlign w:val="center"/>
+          </w:tcPr>
+          <w:p>
+            <w:pPr>
+              <w:pStyle w:val="Ttulodelatabla"/>
+              <w:bidi w:val="0"/>
+              <w:jc w:val="left"/>
+              <w:rPr/>
+            </w:pPr>
+            <w:r>
+              <w:rPr/>
+              <w:t>Ámbito</w:t>
+            </w:r>
+          </w:p>
+        </w:tc>
+        <w:tc>
+          <w:tcPr>
+            <w:tcW w:w="1314" w:type="dxa"/>
+            <w:tcBorders>
+              <w:top w:val="single" w:sz="2" w:space="0" w:color="DDDDDD"/>
+              <w:left w:val="single" w:sz="2" w:space="0" w:color="DDDDDD"/>
+              <w:bottom w:val="single" w:sz="2" w:space="0" w:color="DDDDDD"/>
+              <w:right w:val="single" w:sz="2" w:space="0" w:color="DDDDDD"/>
+            </w:tcBorders>
+            <w:shd w:fill="F2F2F2" w:val="clear"/>
+            <w:vAlign w:val="center"/>
+          </w:tcPr>
+          <w:p>
+            <w:pPr>
+              <w:pStyle w:val="Ttulodelatabla"/>
+              <w:bidi w:val="0"/>
+              <w:jc w:val="left"/>
+              <w:rPr/>
+            </w:pPr>
+            <w:r>
+              <w:rPr/>
+              <w:t>Comunidad</w:t>
+            </w:r>
+          </w:p>
+        </w:tc>
+        <w:tc>
+          <w:tcPr>
+            <w:tcW w:w="1082" w:type="dxa"/>
+            <w:tcBorders>
+              <w:top w:val="single" w:sz="2" w:space="0" w:color="DDDDDD"/>
+              <w:left w:val="single" w:sz="2" w:space="0" w:color="DDDDDD"/>
+              <w:bottom w:val="single" w:sz="2" w:space="0" w:color="DDDDDD"/>
+              <w:right w:val="single" w:sz="2" w:space="0" w:color="DDDDDD"/>
+            </w:tcBorders>
+            <w:shd w:fill="F2F2F2" w:val="clear"/>
+            <w:vAlign w:val="center"/>
+          </w:tcPr>
+          <w:p>
+            <w:pPr>
+              <w:pStyle w:val="Ttulodelatabla"/>
+              <w:bidi w:val="0"/>
+              <w:jc w:val="left"/>
+              <w:rPr/>
+            </w:pPr>
+            <w:r>
+              <w:rPr/>
+              <w:t>Provincia</w:t>
+            </w:r>
+          </w:p>
+        </w:tc>
+        <w:tc>
+          <w:tcPr>
+            <w:tcW w:w="1694" w:type="dxa"/>
+            <w:tcBorders>
+              <w:top w:val="single" w:sz="2" w:space="0" w:color="DDDDDD"/>
+              <w:left w:val="single" w:sz="2" w:space="0" w:color="DDDDDD"/>
+              <w:bottom w:val="single" w:sz="2" w:space="0" w:color="DDDDDD"/>
+              <w:right w:val="single" w:sz="2" w:space="0" w:color="DDDDDD"/>
+            </w:tcBorders>
+            <w:shd w:fill="F2F2F2" w:val="clear"/>
+            <w:vAlign w:val="center"/>
+          </w:tcPr>
+          <w:p>
+            <w:pPr>
+              <w:pStyle w:val="Ttulodelatabla"/>
+              <w:bidi w:val="0"/>
+              <w:jc w:val="left"/>
+              <w:rPr/>
+            </w:pPr>
+            <w:r>
+              <w:rPr/>
+              <w:t>Sectores</w:t>
+            </w:r>
+          </w:p>
+        </w:tc>
+        <w:tc>
+          <w:tcPr>
+            <w:tcW w:w="1279" w:type="dxa"/>
+            <w:tcBorders>
+              <w:top w:val="single" w:sz="2" w:space="0" w:color="DDDDDD"/>
+              <w:left w:val="single" w:sz="2" w:space="0" w:color="DDDDDD"/>
+              <w:bottom w:val="single" w:sz="2" w:space="0" w:color="DDDDDD"/>
+              <w:right w:val="single" w:sz="2" w:space="0" w:color="DDDDDD"/>
+            </w:tcBorders>
+            <w:shd w:fill="F2F2F2" w:val="clear"/>
+            <w:vAlign w:val="center"/>
+          </w:tcPr>
+          <w:p>
+            <w:pPr>
+              <w:pStyle w:val="Ttulodelatabla"/>
+              <w:bidi w:val="0"/>
+              <w:jc w:val="left"/>
+              <w:rPr/>
+            </w:pPr>
+            <w:r>
+              <w:rPr/>
+              <w:t>Web</w:t>
+            </w:r>
+          </w:p>
+        </w:tc>
+        <w:tc>
+          <w:tcPr>
+            <w:tcW w:w="1072" w:type="dxa"/>
+            <w:tcBorders>
+              <w:top w:val="single" w:sz="2" w:space="0" w:color="DDDDDD"/>
+              <w:left w:val="single" w:sz="2" w:space="0" w:color="DDDDDD"/>
+              <w:bottom w:val="single" w:sz="2" w:space="0" w:color="DDDDDD"/>
+              <w:right w:val="single" w:sz="2" w:space="0" w:color="DDDDDD"/>
+            </w:tcBorders>
+            <w:shd w:fill="F2F2F2" w:val="clear"/>
+            <w:vAlign w:val="center"/>
+          </w:tcPr>
+          <w:p>
+            <w:pPr>
+              <w:pStyle w:val="Ttulodelatabla"/>
+              <w:bidi w:val="0"/>
+              <w:jc w:val="left"/>
+              <w:rPr/>
+            </w:pPr>
+            <w:r>
+              <w:rPr/>
+              <w:t>Teléfono</w:t>
+            </w:r>
+          </w:p>
+        </w:tc>
+        <w:tc>
+          <w:tcPr>
+            <w:tcW w:w="2282" w:type="dxa"/>
+            <w:tcBorders>
+              <w:top w:val="single" w:sz="2" w:space="0" w:color="DDDDDD"/>
+              <w:left w:val="single" w:sz="2" w:space="0" w:color="DDDDDD"/>
+              <w:bottom w:val="single" w:sz="2" w:space="0" w:color="DDDDDD"/>
+              <w:right w:val="single" w:sz="2" w:space="0" w:color="DDDDDD"/>
+            </w:tcBorders>
+            <w:shd w:fill="F2F2F2" w:val="clear"/>
+            <w:vAlign w:val="center"/>
+          </w:tcPr>
+          <w:p>
+            <w:pPr>
+              <w:pStyle w:val="Ttulodelatabla"/>
+              <w:bidi w:val="0"/>
+              <w:jc w:val="left"/>
+              <w:rPr/>
+            </w:pPr>
+            <w:r>
+              <w:rPr/>
+              <w:t>Email</w:t>
+            </w:r>
+          </w:p>
+        </w:tc>
+        <w:tc>
+          <w:tcPr>
+            <w:tcW w:w="1769" w:type="dxa"/>
+            <w:tcBorders>
+              <w:top w:val="single" w:sz="2" w:space="0" w:color="DDDDDD"/>
+              <w:left w:val="single" w:sz="2" w:space="0" w:color="DDDDDD"/>
+              <w:bottom w:val="single" w:sz="2" w:space="0" w:color="DDDDDD"/>
+              <w:right w:val="single" w:sz="2" w:space="0" w:color="DDDDDD"/>
+            </w:tcBorders>
+            <w:shd w:fill="F2F2F2" w:val="clear"/>
+            <w:vAlign w:val="center"/>
+          </w:tcPr>
+          <w:p>
+            <w:pPr>
+              <w:pStyle w:val="Ttulodelatabla"/>
+              <w:bidi w:val="0"/>
+              <w:jc w:val="left"/>
+              <w:rPr/>
+            </w:pPr>
+            <w:r>
+              <w:rPr/>
+              <w:t>Dirección</w:t>
+            </w:r>
+          </w:p>
+        </w:tc>
+        <w:tc>
+          <w:tcPr>
+            <w:tcW w:w="1138" w:type="dxa"/>
+            <w:tcBorders>
+              <w:top w:val="single" w:sz="2" w:space="0" w:color="DDDDDD"/>
+              <w:left w:val="single" w:sz="2" w:space="0" w:color="DDDDDD"/>
+              <w:bottom w:val="single" w:sz="2" w:space="0" w:color="DDDDDD"/>
+              <w:right w:val="single" w:sz="2" w:space="0" w:color="DDDDDD"/>
+            </w:tcBorders>
+            <w:shd w:fill="F2F2F2" w:val="clear"/>
+            <w:vAlign w:val="center"/>
+          </w:tcPr>
+          <w:p>
+            <w:pPr>
+              <w:pStyle w:val="Ttulodelatabla"/>
+              <w:bidi w:val="0"/>
+              <w:jc w:val="left"/>
+              <w:rPr/>
+            </w:pPr>
+            <w:r>
+              <w:rPr/>
+              <w:t>Prioridad</w:t>
+            </w:r>
+          </w:p>
+        </w:tc>
+      </w:tr>
+      <w:tr>
+        <w:trPr/>
+        <w:tc>
+          <w:tcPr>
+            <w:tcW w:w="1499" w:type="dxa"/>
+            <w:tcBorders>
+              <w:top w:val="single" w:sz="2" w:space="0" w:color="DDDDDD"/>
+              <w:left w:val="single" w:sz="2" w:space="0" w:color="DDDDDD"/>
+              <w:bottom w:val="single" w:sz="2" w:space="0" w:color="DDDDDD"/>
+              <w:right w:val="single" w:sz="2" w:space="0" w:color="DDDDDD"/>
+            </w:tcBorders>
+            <w:vAlign w:val="center"/>
+          </w:tcPr>
+          <w:p>
+            <w:pPr>
+              <w:pStyle w:val="Contenidodelatabla"/>
+              <w:bidi w:val="0"/>
+              <w:jc w:val="left"/>
+              <w:rPr/>
+            </w:pPr>
+            <w:r>
+              <w:rPr/>
+              <w:t>ASIECAN</w:t>
+            </w:r>
+          </w:p>
+        </w:tc>
+        <w:tc>
+          <w:tcPr>
+            <w:tcW w:w="1441" w:type="dxa"/>
+            <w:tcBorders>
+              <w:top w:val="single" w:sz="2" w:space="0" w:color="DDDDDD"/>
+              <w:left w:val="single" w:sz="2" w:space="0" w:color="DDDDDD"/>
+              <w:bottom w:val="single" w:sz="2" w:space="0" w:color="DDDDDD"/>
+              <w:right w:val="single" w:sz="2" w:space="0" w:color="DDDDDD"/>
+            </w:tcBorders>
+            <w:vAlign w:val="center"/>
+          </w:tcPr>
+          <w:p>
+            <w:pPr>
+              <w:pStyle w:val="Contenidodelatabla"/>
+              <w:bidi w:val="0"/>
+              <w:jc w:val="left"/>
+              <w:rPr/>
+            </w:pPr>
+            <w:r>
+              <w:rPr/>
+              <w:t>Autonómico/Provincial</w:t>
+            </w:r>
+          </w:p>
+        </w:tc>
+        <w:tc>
+          <w:tcPr>
+            <w:tcW w:w="1314" w:type="dxa"/>
+            <w:tcBorders>
+              <w:top w:val="single" w:sz="2" w:space="0" w:color="DDDDDD"/>
+              <w:left w:val="single" w:sz="2" w:space="0" w:color="DDDDDD"/>
+              <w:bottom w:val="single" w:sz="2" w:space="0" w:color="DDDDDD"/>
+              <w:right w:val="single" w:sz="2" w:space="0" w:color="DDDDDD"/>
+            </w:tcBorders>
+            <w:vAlign w:val="center"/>
+          </w:tcPr>
+          <w:p>
+            <w:pPr>
+              <w:pStyle w:val="Contenidodelatabla"/>
+              <w:bidi w:val="0"/>
+              <w:jc w:val="left"/>
+              <w:rPr/>
+            </w:pPr>
+            <w:r>
+              <w:rPr/>
+              <w:t>Cantabria</w:t>
+            </w:r>
+          </w:p>
+        </w:tc>
+        <w:tc>
+          <w:tcPr>
+            <w:tcW w:w="1082" w:type="dxa"/>
+            <w:tcBorders>
+              <w:top w:val="single" w:sz="2" w:space="0" w:color="DDDDDD"/>
+              <w:left w:val="single" w:sz="2" w:space="0" w:color="DDDDDD"/>
+              <w:bottom w:val="single" w:sz="2" w:space="0" w:color="DDDDDD"/>
+              <w:right w:val="single" w:sz="2" w:space="0" w:color="DDDDDD"/>
+            </w:tcBorders>
+            <w:vAlign w:val="center"/>
+          </w:tcPr>
+          <w:p>
+            <w:pPr>
+              <w:pStyle w:val="Contenidodelatabla"/>
+              <w:bidi w:val="0"/>
+              <w:jc w:val="left"/>
+              <w:rPr/>
+            </w:pPr>
+            <w:r>
+              <w:rPr/>
+              <w:t>Cantabria</w:t>
+            </w:r>
+          </w:p>
+        </w:tc>
+        <w:tc>
+          <w:tcPr>
+            <w:tcW w:w="1694" w:type="dxa"/>
+            <w:tcBorders>
+              <w:top w:val="single" w:sz="2" w:space="0" w:color="DDDDDD"/>
+              <w:left w:val="single" w:sz="2" w:space="0" w:color="DDDDDD"/>
+              <w:bottom w:val="single" w:sz="2" w:space="0" w:color="DDDDDD"/>
+              <w:right w:val="single" w:sz="2" w:space="0" w:color="DDDDDD"/>
+            </w:tcBorders>
+            <w:vAlign w:val="center"/>
+          </w:tcPr>
+          <w:p>
+            <w:pPr>
+              <w:pStyle w:val="Contenidodelatabla"/>
+              <w:bidi w:val="0"/>
+              <w:jc w:val="left"/>
+              <w:rPr/>
+            </w:pPr>
+            <w:r>
+              <w:rPr/>
+              <w:t>Electricidad, telecomunicaciones, energías renovables asiecan+1</w:t>
+            </w:r>
+          </w:p>
+        </w:tc>
+        <w:tc>
+          <w:tcPr>
+            <w:tcW w:w="1279" w:type="dxa"/>
+            <w:tcBorders>
+              <w:top w:val="single" w:sz="2" w:space="0" w:color="DDDDDD"/>
+              <w:left w:val="single" w:sz="2" w:space="0" w:color="DDDDDD"/>
+              <w:bottom w:val="single" w:sz="2" w:space="0" w:color="DDDDDD"/>
+              <w:right w:val="single" w:sz="2" w:space="0" w:color="DDDDDD"/>
+            </w:tcBorders>
+            <w:vAlign w:val="center"/>
+          </w:tcPr>
+          <w:p>
+            <w:pPr>
+              <w:pStyle w:val="Contenidodelatabla"/>
+              <w:bidi w:val="0"/>
+              <w:jc w:val="left"/>
+              <w:rPr/>
+            </w:pPr>
+            <w:hyperlink r:id="rId23" w:tgtFrame="_blank">
+              <w:r>
+                <w:rPr>
+                  <w:rStyle w:val="EnlacedeInternet"/>
+                </w:rPr>
+                <w:t>asiecan.com</w:t>
+              </w:r>
+            </w:hyperlink>
+          </w:p>
+        </w:tc>
+        <w:tc>
+          <w:tcPr>
+            <w:tcW w:w="1072" w:type="dxa"/>
+            <w:tcBorders>
+              <w:top w:val="single" w:sz="2" w:space="0" w:color="DDDDDD"/>
+              <w:left w:val="single" w:sz="2" w:space="0" w:color="DDDDDD"/>
+              <w:bottom w:val="single" w:sz="2" w:space="0" w:color="DDDDDD"/>
+              <w:right w:val="single" w:sz="2" w:space="0" w:color="DDDDDD"/>
+            </w:tcBorders>
+            <w:vAlign w:val="center"/>
+          </w:tcPr>
+          <w:p>
+            <w:pPr>
+              <w:pStyle w:val="Contenidodelatabla"/>
+              <w:bidi w:val="0"/>
+              <w:jc w:val="left"/>
+              <w:rPr/>
+            </w:pPr>
+            <w:r>
+              <w:rPr/>
+              <w:t>942 266 394 asiecan+1</w:t>
+            </w:r>
+          </w:p>
+        </w:tc>
+        <w:tc>
+          <w:tcPr>
+            <w:tcW w:w="2282" w:type="dxa"/>
+            <w:tcBorders>
+              <w:top w:val="single" w:sz="2" w:space="0" w:color="DDDDDD"/>
+              <w:left w:val="single" w:sz="2" w:space="0" w:color="DDDDDD"/>
+              <w:bottom w:val="single" w:sz="2" w:space="0" w:color="DDDDDD"/>
+              <w:right w:val="single" w:sz="2" w:space="0" w:color="DDDDDD"/>
+            </w:tcBorders>
+            <w:vAlign w:val="center"/>
+          </w:tcPr>
+          <w:p>
+            <w:pPr>
+              <w:pStyle w:val="Contenidodelatabla"/>
+              <w:bidi w:val="0"/>
+              <w:jc w:val="left"/>
+              <w:rPr/>
+            </w:pPr>
+            <w:r>
+              <w:rPr/>
+              <w:t>asiecan@asiecan.com asiecan+1</w:t>
+            </w:r>
+          </w:p>
+        </w:tc>
+        <w:tc>
+          <w:tcPr>
+            <w:tcW w:w="1769" w:type="dxa"/>
+            <w:tcBorders>
+              <w:top w:val="single" w:sz="2" w:space="0" w:color="DDDDDD"/>
+              <w:left w:val="single" w:sz="2" w:space="0" w:color="DDDDDD"/>
+              <w:bottom w:val="single" w:sz="2" w:space="0" w:color="DDDDDD"/>
+              <w:right w:val="single" w:sz="2" w:space="0" w:color="DDDDDD"/>
+            </w:tcBorders>
+            <w:vAlign w:val="center"/>
+          </w:tcPr>
+          <w:p>
+            <w:pPr>
+              <w:pStyle w:val="Contenidodelatabla"/>
+              <w:bidi w:val="0"/>
+              <w:jc w:val="left"/>
+              <w:rPr/>
+            </w:pPr>
+            <w:r>
+              <w:rPr/>
+              <w:t>C/ 1º de Mayo 64, Zoco Gran Santander, local 111, 39011 Santander (Cantabria) asiecan+1</w:t>
+            </w:r>
+          </w:p>
+        </w:tc>
+        <w:tc>
+          <w:tcPr>
+            <w:tcW w:w="1138" w:type="dxa"/>
+            <w:tcBorders>
+              <w:top w:val="single" w:sz="2" w:space="0" w:color="DDDDDD"/>
+              <w:left w:val="single" w:sz="2" w:space="0" w:color="DDDDDD"/>
+              <w:bottom w:val="single" w:sz="2" w:space="0" w:color="DDDDDD"/>
+              <w:right w:val="single" w:sz="2" w:space="0" w:color="DDDDDD"/>
+            </w:tcBorders>
+            <w:vAlign w:val="center"/>
+          </w:tcPr>
+          <w:p>
+            <w:pPr>
+              <w:pStyle w:val="Contenidodelatabla"/>
+              <w:bidi w:val="0"/>
+              <w:jc w:val="left"/>
+              <w:rPr/>
+            </w:pPr>
+            <w:r>
+              <w:rPr/>
+              <w:t>Muy alta</w:t>
             </w:r>
           </w:p>
         </w:tc>

</xml_diff>